<commit_message>
changes for "load percent to percent of nominal speed"
</commit_message>
<xml_diff>
--- a/paper/Data_in_Brief_DCData_mendeley.docx
+++ b/paper/Data_in_Brief_DCData_mendeley.docx
@@ -72,7 +72,7 @@
         <w:t xml:space="preserve">Keywords: </w:t>
       </w:r>
       <w:r>
-        <w:t>Armature current; AV-160B vibrometer; Smartphone microphone; Thyristor converter; Load estimation; Foundation looseness; Fault diagnosis; Machine learning</w:t>
+        <w:t>Armature current; AV-160B vibrometer; Smartphone microphone; Thyristor converter; Speed estimation; Foundation looseness; Fault diagnosis; Machine learning</w:t>
       </w:r>
     </w:p>
     <w:p>
@@ -86,7 +86,7 @@
     </w:p>
     <w:p>
       <w:r>
-        <w:t>This article presents a multi-sensor condition-monitoring dataset recorded from a brushed permanent-magnet DC servo motor (3PI12.12; 625 W, 110 V DC, 12.5 A, 5.4 N·m, 2000 rpm) driven by a four-quadrant thyristor (SCR) converter with armature voltage and current control. The machine was operated across up to thirteen load levels (1, 2, 5, 10, 20, 30, 40, 50, 60, 70, 80, 90 and 100 % of rated power) under 8 operating conditions that combine four control/mechanical states — normal operation, a detuned speed-regulator gain, a detuned speed- and current-regulator gain, and a deliberately loosened foundation — each recorded without and with periodic direction reversal. For every operating point, four sensors were recorded separately under the same operating conditions: the armature current with a Rigol MSO5074 oscilloscope (native binary waveforms), the true vibration waveform from the AC output of an AV-160B piezoelectric vibrometer (44.1 kHz, 16-bit stereo WAV), the airborne sound from a budget Android smartphone microphone placed about 1 m away (AAC/M4A), and AV-160B spot readings of velocity, acceleration and displacement (XLS). The repository is published as raw, untransformed recordings and comprises 386 files (98 BIN, 98 WAV, 98 M4A, 91 XLS, 1 STP), together with a per-file metadata index (sample rate, duration, channels, bit depth and file size), a 3-D CAD model of the test rig, a README and a CC BY 4.0 licence. The dataset supports load estimation, operating-condition classification, direction-reversal and converter-ripple analysis, and benchmarking of low-cost smartphone audio against instrument-grade current and vibration references.</w:t>
+        <w:t>This article presents a multi-sensor condition-monitoring dataset recorded from a brushed permanent-magnet DC servo motor (3PI12.12; 625 W, 110 V DC, 12.5 A, 5.4 N·m, 2000 rpm) driven by a four-quadrant thyristor (SCR) converter with armature voltage and current control. The machine was operated, with no external mechanical load, across up to thirteen speed setpoints (1, 2, 5, 10, 20, 30, 40, 50, 60, 70, 80, 90 and 100 % of rated speed) under 8 operating conditions that combine four control/mechanical states — normal operation, a detuned speed-regulator gain, a detuned speed- and current-regulator gain, and a deliberately loosened foundation — each recorded without and with periodic direction reversal. For every operating point, four sensors were recorded separately under the same operating conditions: the armature current with a Rigol MSO5074 oscilloscope (native binary waveforms), the true vibration waveform from the AC output of an AV-160B piezoelectric vibrometer (44.1 kHz, 16-bit stereo WAV), the airborne sound from a budget Android smartphone microphone placed about 1 m away (AAC/M4A), and AV-160B spot readings of velocity, acceleration and displacement (XLS). The repository is published as raw, untransformed recordings and comprises 386 files (98 BIN, 98 WAV, 98 M4A, 91 XLS, 1 STP), together with a per-file metadata index (sample rate, duration, channels, bit depth and file size), a 3-D CAD model of the test rig, a README and a CC BY 4.0 licence. The dataset supports speed estimation, operating-condition classification, direction-reversal and converter-ripple analysis, and benchmarking of low-cost smartphone audio against instrument-grade current and vibration references.</w:t>
       </w:r>
     </w:p>
     <w:p>
@@ -232,7 +232,7 @@
               <w:rPr>
                 <w:sz w:val="19"/>
               </w:rPr>
-              <w:t>Recorded on a laboratory test rig comprising a brushed PM DC servo motor (3PI12.12) driven by a four-quadrant thyristor (SCR) converter with a coupled load unit. Armature current was captured with a Rigol MSO5074 oscilloscope; the vibration waveform and spot readings (per ISO 2954) were taken with an AV-160B vibrometer; airborne sound was recorded with a budget Android smartphone at ~1 m. Each sensor was recorded separately under the same operating conditions.</w:t>
+              <w:t>Recorded on a laboratory test rig comprising a brushed PM DC servo motor (3PI12.12) driven by a four-quadrant thyristor (SCR) converter with no external mechanical load (the motor runs unloaded). Armature current was captured with a Rigol MSO5074 oscilloscope; the vibration waveform and spot readings (per ISO 2954) were taken with an AV-160B vibrometer; airborne sound was recorded with a budget Android smartphone at ~1 m. Each sensor was recorded separately under the same operating conditions.</w:t>
             </w:r>
           </w:p>
         </w:tc>
@@ -349,7 +349,7 @@
         <w:pStyle w:val="ListBullet"/>
       </w:pPr>
       <w:r>
-        <w:t>The dataset provides raw, matched-condition multi-sensor recordings (armature current, vibrometer vibration waveform, smartphone audio and vibrometer spot readings) of a brushed DC servo motor across a wide load range, giving ready-made regression (load percent) and classification (operating condition) labels.</w:t>
+        <w:t>The dataset provides raw, matched-condition multi-sensor recordings (armature current, vibrometer vibration waveform, smartphone audio and vibrometer spot readings) of a brushed DC servo motor across a wide speed range, giving ready-made regression (speed setpoint, % of rated speed) and classification (operating condition) labels.</w:t>
       </w:r>
     </w:p>
     <w:p>
@@ -399,7 +399,7 @@
     </w:p>
     <w:p>
       <w:r>
-        <w:t>Condition monitoring of electrical drives traditionally relies on invasive or specialised instrumentation such as current probes and contact vibrometers, which can be costly or impractical to deploy widely [1,2]. Airborne sound captured by ubiquitous smartphones is an attractive low-cost, non-contact alternative, but its diagnostic value must be assessed against instrument-grade references acquired under the same operating conditions [3]. This dataset was compiled to enable that comparison for a brushed permanent-magnet DC servo motor driven by a four-quadrant thyristor converter — a drive whose armature current carries a characteristic 300 Hz (6 × 50 Hz) six-pulse converter ripple in addition to commutation signatures. The motor was exercised across a broad load range under normal operation, two levels of controller detuning and a loosened-foundation condition, each without and with periodic direction reversal, while four sensors were recorded separately under matched conditions. The resulting raw recordings allow researchers to compare models trained on smartphone audio against those trained on current and vibration signals, and to study load estimation, foundation-looseness detection, direction-reversal transients and converter/commutation signatures. The data are released raw and untransformed so that users can apply their own preprocessing pipelines [4].</w:t>
+        <w:t>Condition monitoring of electrical drives traditionally relies on invasive or specialised instrumentation such as current probes and contact vibrometers, which can be costly or impractical to deploy widely [1,2]. Airborne sound captured by ubiquitous smartphones is an attractive low-cost, non-contact alternative, but its diagnostic value must be assessed against instrument-grade references acquired under the same operating conditions [3]. This dataset was compiled to enable that comparison for a brushed permanent-magnet DC servo motor driven by a four-quadrant thyristor converter — a drive whose armature current carries a characteristic 300 Hz (6 × 50 Hz) six-pulse converter ripple in addition to commutation signatures. The motor was exercised across a broad speed range under normal operation, two levels of controller detuning and a loosened-foundation condition, each without and with periodic direction reversal, while four sensors were recorded separately under matched conditions. The resulting raw recordings allow researchers to compare models trained on smartphone audio against those trained on current and vibration signals, and to study speed estimation, foundation-looseness detection, direction-reversal transients and converter/commutation signatures. The data are released raw and untransformed so that users can apply their own preprocessing pipelines [4].</w:t>
       </w:r>
     </w:p>
     <w:p>
@@ -417,7 +417,7 @@
     </w:p>
     <w:p>
       <w:r>
-        <w:t>The dataset contains raw multi-sensor recordings acquired from a single brushed permanent-magnet DC servo motor on a laboratory test rig. It is published as byte-for-byte raw recordings organised by operating condition, sensor and load level, together with a per-file metadata index, a 3-D CAD model of the rig, a README descriptor and a licence file. In total the repository contains 386 files (98 BIN, 98 WAV, 98 M4A, 91 XLS, 1 STP). Table 1 lists the top-level organisation of the repository.</w:t>
+        <w:t>The dataset contains raw multi-sensor recordings acquired from a single brushed permanent-magnet DC servo motor on a laboratory test rig. It is published as byte-for-byte raw recordings organised by operating condition, sensor and speed setpoint, together with a per-file metadata index, a 3-D CAD model of the rig, a README descriptor and a licence file. In total the repository contains 386 files (98 BIN, 98 WAV, 98 M4A, 91 XLS, 1 STP). Table 1 lists the top-level organisation of the repository.</w:t>
       </w:r>
     </w:p>
     <w:p>
@@ -509,7 +509,7 @@
               <w:rPr>
                 <w:sz w:val="19"/>
               </w:rPr>
-              <w:t>Raw recordings organised as &lt;condition&gt;/&lt;sensor&gt;/loadNNN_sensor.ext</w:t>
+              <w:t>Raw recordings organised as &lt;condition&gt;/&lt;sensor&gt;/speedNNN_sensor.ext</w:t>
             </w:r>
           </w:p>
         </w:tc>
@@ -1001,12 +1001,12 @@
     </w:tbl>
     <w:p>
       <w:r>
-        <w:t>The recordings span 8 operating conditions, each a folder under data/ formed by combining an operation state with a reversal mode (without or with periodic direction reversal). Table 3 lists the conditions and the load levels (% of rated power) present for each. Naming note: the detuned-speed-regulator condition uses a non-optimal speed-regulator gain, whereas the detuned speed-and-current-regulator (RT) condition additionally uses a non-optimal current-regulator gain.</w:t>
+        <w:t>The recordings span 8 operating conditions, each a folder under data/ formed by combining an operation state with a reversal mode (without or with periodic direction reversal). Table 3 lists the conditions and the speed setpoints (% of rated speed) present for each. Naming note: the detuned-speed-regulator condition uses a non-optimal speed-regulator gain, whereas the detuned speed-and-current-regulator (RT) condition additionally uses a non-optimal current-regulator gain.</w:t>
       </w:r>
     </w:p>
     <w:p>
       <w:r>
-        <w:t>Table 3. Operating conditions and available load levels.</w:t>
+        <w:t>Table 3. Operating conditions and available speed setpoints.</w:t>
       </w:r>
     </w:p>
     <w:tbl>
@@ -1080,7 +1080,7 @@
                 <w:b/>
                 <w:sz w:val="20"/>
               </w:rPr>
-              <w:t>Load levels (%)</w:t>
+              <w:t>Speed setpoints (%)</w:t>
             </w:r>
           </w:p>
         </w:tc>
@@ -2069,7 +2069,7 @@
     </w:tbl>
     <w:p>
       <w:r>
-        <w:t>Files follow the naming scheme loadNNN_sensor.ext, where NNN is the zero-padded load percent (e.g. load020 = 20 % load). The metadata.csv index has one row per file; its fields are described in Table 5.</w:t>
+        <w:t>Files follow the naming scheme speedNNN_sensor.ext, where NNN is the zero-padded speed setpoint (e.g. speed020 = 20 % of rated speed); the speed prefix denotes the commanded speed and the motor runs unloaded. The metadata.csv index has one row per file; its fields are described in Table 5.</w:t>
       </w:r>
     </w:p>
     <w:p>
@@ -2221,7 +2221,7 @@
               <w:rPr>
                 <w:sz w:val="19"/>
               </w:rPr>
-              <w:t>load_percent</w:t>
+              <w:t>speed_percent</w:t>
             </w:r>
           </w:p>
         </w:tc>
@@ -2235,7 +2235,7 @@
               <w:rPr>
                 <w:sz w:val="19"/>
               </w:rPr>
-              <w:t>Load level as a percentage of rated power</w:t>
+              <w:t>Speed setpoint as a percentage of rated speed (2000 rpm)</w:t>
             </w:r>
           </w:p>
         </w:tc>
@@ -2543,7 +2543,7 @@
     </w:tbl>
     <w:p>
       <w:r>
-        <w:t>Table 6 gives the number of files available per operating condition and sensor. Coverage is near-complete on the nominal load grid; the detuned-control conditions reach only a ~65 % top load because the detuned controller trips above that level, the vibration spot readings omit the near-zero-load points where vibration is negligible, and a few individual load points may be absent in a branch. The 385 sensor recordings listed in Table 6 are complemented by the CAD model, giving 386 files in total.</w:t>
+        <w:t>Table 6 gives the number of files available per operating condition and sensor. Coverage is near-complete on the nominal speed grid; the detuned-control conditions reach only a ~65 % top speed setpoint because the detuned controller trips above that speed, the vibration spot readings omit the near-zero-speed points where vibration is negligible, and a few individual speed points may be absent in a branch. The 385 sensor recordings listed in Table 6 are complemented by the CAD model, giving 386 files in total.</w:t>
       </w:r>
     </w:p>
     <w:p>
@@ -3435,7 +3435,7 @@
     </w:tbl>
     <w:p>
       <w:r>
-        <w:t>Figure 1 illustrates the overall organisation of the repository. Figures 2–4 present representative raw data from one operating point (normal operation, no reversal, 50 % load): the armature current and its amplitude spectrum, the vibrometer vibration waveform and its spectrogram, and the trend of the AV-160B spot readings with load. The figures illustrate the types of raw data included in the dataset without any additional interpretation.</w:t>
+        <w:t>Figure 1 illustrates the overall organisation of the repository. Figures 2–4 present representative raw data from one operating point (normal operation, no reversal, 50 % speed setpoint): the armature current and its amplitude spectrum, the vibrometer vibration waveform and its spectrogram, and the trend of the AV-160B spot readings with speed. The figures illustrate the types of raw data included in the dataset without any additional interpretation.</w:t>
       </w:r>
     </w:p>
     <w:p>
@@ -3445,7 +3445,7 @@
       <w:r>
         <w:drawing>
           <wp:inline xmlns:a="http://schemas.openxmlformats.org/drawingml/2006/main" xmlns:pic="http://schemas.openxmlformats.org/drawingml/2006/picture">
-            <wp:extent cx="5852160" cy="3535747"/>
+            <wp:extent cx="5852160" cy="3741433"/>
             <wp:docPr id="1" name="Picture 1"/>
             <wp:cNvGraphicFramePr>
               <a:graphicFrameLocks noChangeAspect="1"/>
@@ -3466,7 +3466,7 @@
                   <pic:spPr>
                     <a:xfrm>
                       <a:off x="0" y="0"/>
-                      <a:ext cx="5852160" cy="3535747"/>
+                      <a:ext cx="5852160" cy="3741433"/>
                     </a:xfrm>
                     <a:prstGeom prst="rect"/>
                   </pic:spPr>
@@ -3537,7 +3537,7 @@
           <w:i/>
           <w:sz w:val="18"/>
         </w:rPr>
-        <w:t>Fig. 2. Representative armature-current recording (normal operation, no reversal, 50 % load): (a) a 60 ms window of the AC-coupled waveform and (b) its single-sided amplitude spectrum, showing the 300 Hz six-pulse converter ripple and its harmonics.</w:t>
+        <w:t>Fig. 2. Representative armature-current recording (normal operation, no reversal, 50 % speed setpoint): (a) a 60 ms window of the AC-coupled waveform and (b) its single-sided amplitude spectrum, showing the 300 Hz six-pulse converter ripple and its harmonics.</w:t>
       </w:r>
     </w:p>
     <w:p>
@@ -3588,7 +3588,7 @@
           <w:i/>
           <w:sz w:val="18"/>
         </w:rPr>
-        <w:t>Fig. 3. Representative vibrometer vibration recording (normal operation, no reversal, 50 % load): (a) a 1 s window of the waveform and (b) its spectrogram up to 10 kHz.</w:t>
+        <w:t>Fig. 3. Representative vibrometer vibration recording (normal operation, no reversal, 50 % speed setpoint): (a) a 1 s window of the waveform and (b) its spectrogram up to 10 kHz.</w:t>
       </w:r>
     </w:p>
     <w:p>
@@ -3639,7 +3639,7 @@
           <w:i/>
           <w:sz w:val="18"/>
         </w:rPr>
-        <w:t>Fig. 4. AV-160B vibration spot readings (mean velocity, acceleration and displacement) as a function of load for the normal, no-reversal condition.</w:t>
+        <w:t>Fig. 4. AV-160B vibration spot readings (mean velocity, acceleration and displacement) as a function of speed setpoint (% of rated speed) for the normal, no-reversal condition.</w:t>
       </w:r>
     </w:p>
     <w:p>
@@ -3657,12 +3657,12 @@
     </w:p>
     <w:p>
       <w:r>
-        <w:t>Test rig. The brushed PM DC servo motor described in Table 2 was driven by a four-quadrant thyristor (SCR) converter providing armature voltage and current control. Mechanical load was applied with a coupled load unit and set to 1, 2, 5, 10, 20, 30, 40, 50, 60, 70, 80, 90 and 100 % of rated power (a reduced top load applies to the detuned-control conditions, as noted below).</w:t>
+        <w:t>Test rig. The brushed PM DC servo motor described in Table 2 was driven by a four-quadrant thyristor (SCR) converter providing armature voltage and current control. No external mechanical load was applied — the motor ran unloaded — and the drive was commanded to a speed setpoint of 1, 2, 5, 10, 20, 30, 40, 50, 60, 70, 80, 90 and 100 % of rated speed (2000 rpm; a reduced top speed applies to the detuned-control conditions, as noted below).</w:t>
       </w:r>
     </w:p>
     <w:p>
       <w:r>
-        <w:t>Operating conditions. The load sweep was repeated for each operating condition. Normal operation uses the nominal controller tuning. The two detuned-control conditions use a non-optimal speed-regulator gain (suboptimal_control) and, additionally, a non-optimal current-regulator gain (suboptimal_control_rt). The loose-foundation condition uses a deliberately loosened mechanical foundation. Each condition was recorded both without and with periodic direction reversal.</w:t>
+        <w:t>Operating conditions. The speed sweep was repeated for each operating condition. Normal operation uses the nominal controller tuning. The two detuned-control conditions use a non-optimal speed-regulator gain (suboptimal_control) and, additionally, a non-optimal current-regulator gain (suboptimal_control_rt). The loose-foundation condition uses a deliberately loosened mechanical foundation. Each condition was recorded both without and with periodic direction reversal.</w:t>
       </w:r>
     </w:p>
     <w:p>
@@ -3672,7 +3672,7 @@
     </w:p>
     <w:p>
       <w:r>
-        <w:t>Procedure. For each condition and load level the motor was brought to steady state, and then each sensor was recorded in turn. The equipment used is summarised in Table 7.</w:t>
+        <w:t>Procedure. For each condition and speed setpoint the motor was brought to steady state, and then each sensor was recorded in turn. The equipment used is summarised in Table 7.</w:t>
       </w:r>
     </w:p>
     <w:p>
@@ -3962,7 +3962,7 @@
     </w:tbl>
     <w:p>
       <w:r>
-        <w:t>Curation. Raw files were copied byte-for-byte from the acquisition folders into a publishable tree with English names and the sortable loadNNN_sensor.ext scheme, and indexed in metadata.csv (including sample rate, duration, channels, bit depth, file size and the original name/path for traceability). No signal transformation was applied. The complete dataset described in this article has been deposited in the Mendeley Data repository [4].</w:t>
+        <w:t>Curation. Raw files were copied byte-for-byte from the acquisition folders into a publishable tree with English names and the sortable speedNNN_sensor.ext scheme, and indexed in metadata.csv (including sample rate, duration, channels, bit depth, file size and the original name/path for traceability). No signal transformation was applied. The complete dataset described in this article has been deposited in the Mendeley Data repository [4].</w:t>
       </w:r>
     </w:p>
     <w:p>
@@ -3980,7 +3980,7 @@
     </w:p>
     <w:p>
       <w:r>
-        <w:t>The four sensors were recorded separately under the same operating conditions rather than simultaneously; recordings are therefore aligned by operating condition and load level, not sample-synchronously. The detuned-control conditions reach only a ~65 % top load because the detuned controller and DC-link protection trip above that level. The vibration XLS files are spot readings rather than waveforms, and the near-zero-load points are absent where vibration is negligible. The smartphone audio is lossy AAC and is intended for qualitative use; the vibrometer WAV is recommended for spectral work. The armature current is captured with the oscilloscope’s 8-bit ADC, and a few individual load points may be missing in a branch. All data come from a single machine and rig, so the dataset does not capture unit-to-unit or design variation, and the loose-foundation condition represents one induced severity. These characteristics should be considered when reusing the dataset or comparing it with data from other machines or setups.</w:t>
+        <w:t>The four sensors were recorded separately under the same operating conditions rather than simultaneously; recordings are therefore aligned by operating condition and speed setpoint, not sample-synchronously. The detuned-control conditions reach only a ~65 % top speed setpoint because the detuned controller and DC-link protection trip above that speed. The vibration XLS files are spot readings rather than waveforms, and the near-zero-speed points are absent where vibration is negligible. The smartphone audio is lossy AAC and is intended for qualitative use; the vibrometer WAV is recommended for spectral work. The armature current is captured with the oscilloscope’s 8-bit ADC, and a few individual speed points may be missing in a branch. All data come from a single machine and rig, so the dataset does not capture unit-to-unit or design variation, and the loose-foundation condition represents one induced severity. These characteristics should be considered when reusing the dataset or comparing it with data from other machines or setups.</w:t>
       </w:r>
     </w:p>
     <w:p>

</xml_diff>

<commit_message>
Update dataset documentation and improve figure descriptions for clarityt
</commit_message>
<xml_diff>
--- a/paper/Data_in_Brief_DCData_mendeley.docx
+++ b/paper/Data_in_Brief_DCData_mendeley.docx
@@ -3445,7 +3445,7 @@
       <w:r>
         <w:drawing>
           <wp:inline xmlns:a="http://schemas.openxmlformats.org/drawingml/2006/main" xmlns:pic="http://schemas.openxmlformats.org/drawingml/2006/picture">
-            <wp:extent cx="5852160" cy="3741433"/>
+            <wp:extent cx="5852160" cy="3765530"/>
             <wp:docPr id="1" name="Picture 1"/>
             <wp:cNvGraphicFramePr>
               <a:graphicFrameLocks noChangeAspect="1"/>
@@ -3466,7 +3466,7 @@
                   <pic:spPr>
                     <a:xfrm>
                       <a:off x="0" y="0"/>
-                      <a:ext cx="5852160" cy="3741433"/>
+                      <a:ext cx="5852160" cy="3765530"/>
                     </a:xfrm>
                     <a:prstGeom prst="rect"/>
                   </pic:spPr>
@@ -3486,7 +3486,7 @@
           <w:i/>
           <w:sz w:val="18"/>
         </w:rPr>
-        <w:t>Fig. 1. Organisation of the dataset, showing the top-level files, the eight operating-condition folders and the four sensor sub-folders with their file formats.</w:t>
+        <w:t>Fig. 1. Organisation of the multi-sensor dataset repository, showing the top-level files, the eight operating-condition folders and the four sensor sub-folders with their file formats.</w:t>
       </w:r>
     </w:p>
     <w:p>

</xml_diff>

<commit_message>
fixed stp file handling
</commit_message>
<xml_diff>
--- a/paper/Data_in_Brief_DCData_mendeley.docx
+++ b/paper/Data_in_Brief_DCData_mendeley.docx
@@ -86,7 +86,7 @@
     </w:p>
     <w:p>
       <w:r>
-        <w:t>This article presents a multi-sensor condition-monitoring dataset recorded from a brushed permanent-magnet DC servo motor (3PI12.06; 350 W, 55 V, 12.5 A continuous, 2.7 N·m at S1 duty, 2000 rpm maximum) driven by a four-quadrant thyristor (SCR) converter with armature voltage and current control. The machine was operated, with no external mechanical load, across up to thirteen speed setpoints (1, 2, 5, 10, 20, 30, 40, 50, 60, 70, 80, 90 and 100 % of rated speed) under 8 operating conditions that combine four control/mechanical states — normal operation, a detuned speed-regulator gain, a detuned speed- and current-regulator gain, and a deliberately loosened foundation — each recorded without and with periodic direction reversal. For every operating point, four sensors were recorded separately under the same operating conditions: the armature current with a Rigol MSO5074 oscilloscope (native binary waveforms), the true vibration waveform from the AC output of an AV-160B piezoelectric vibrometer (44.1 kHz, 16-bit stereo WAV), the airborne sound from a budget Android smartphone microphone placed about 1 m away (AAC/M4A), and AV-160B spot readings of velocity, acceleration and displacement (XLS). The repository is published as raw, untransformed recordings and comprises 386 files (98 BIN, 98 WAV, 98 M4A, 91 XLS, 1 STP), together with a per-file metadata index (sample rate, duration, channels, bit depth and file size), a 3-D CAD model of the test rig, a README and a CC BY 4.0 licence. The dataset supports speed estimation, operating-condition classification, direction-reversal and converter-ripple analysis, and benchmarking of low-cost smartphone audio against instrument-grade current and vibration references.</w:t>
+        <w:t>This article presents a multi-sensor condition-monitoring dataset recorded from a brushed permanent-magnet DC servo motor (3PI12.06; 350 W, 55 V, 12.5 A continuous, 2.7 N·m at S1 duty, 2000 rpm maximum) driven by a four-quadrant thyristor (SCR) converter with armature voltage and current control. The machine was operated, with no external mechanical load, across up to thirteen speed setpoints (1, 2, 5, 10, 20, 30, 40, 50, 60, 70, 80, 90 and 100 % of rated speed) under 8 operating conditions that combine four control/mechanical states — normal operation, a detuned speed-regulator gain, a detuned speed- and current-regulator gain, and a deliberately loosened foundation — each recorded without and with periodic direction reversal. For every operating point, four sensors were recorded separately under the same operating conditions: the armature current with a Rigol MSO5074 oscilloscope (native binary waveforms), the true vibration waveform from the AC output of an AV-160B piezoelectric vibrometer (44.1 kHz, 16-bit stereo WAV), the airborne sound from a budget Android smartphone microphone placed about 1 m away (AAC/M4A), and AV-160B spot readings of velocity, acceleration and displacement (XLS). The repository is published as raw, untransformed recordings and comprises 386 files (98 BIN, 98 WAV, 98 M4A, 91 XLS, 1 STP), together with a per-file metadata index (sample rate, duration, channels, bit depth and file size), the Rigol oscilloscope setup file used for the current acquisitions, a README and a CC BY 4.0 licence. The dataset supports speed estimation, operating-condition classification, direction-reversal and converter-ripple analysis, and benchmarking of low-cost smartphone audio against instrument-grade current and vibration references.</w:t>
       </w:r>
     </w:p>
     <w:p>
@@ -201,7 +201,7 @@
               <w:rPr>
                 <w:sz w:val="19"/>
               </w:rPr>
-              <w:t>Raw armature-current waveforms (.bin); raw vibration waveforms (.wav); raw acoustic recordings (.m4a); vibration spot readings (.xls); metadata index (.csv); 3-D CAD model (.stp); tables and figures. Data are Raw (untransformed).</w:t>
+              <w:t>Raw armature-current waveforms (.bin); raw vibration waveforms (.wav); raw acoustic recordings (.m4a); vibration spot readings (.xls); metadata index (.csv); oscilloscope setup file (.stp); tables and figures. Data are Raw (untransformed).</w:t>
             </w:r>
           </w:p>
         </w:tc>
@@ -381,7 +381,7 @@
         <w:pStyle w:val="ListBullet"/>
       </w:pPr>
       <w:r>
-        <w:t>Publishing the recordings raw and untransformed, with an exact per-file metadata index and a CAD model of the rig, lets users apply their own preprocessing and generate application-specific representations (spectrograms, Mel-spectrograms, scalograms, and current-signature or envelope spectra) and reproduce the acquisition geometry.</w:t>
+        <w:t>Publishing the recordings raw and untransformed, with an exact per-file metadata index and the oscilloscope setup file used for acquisition, lets users apply their own preprocessing and generate application-specific representations (spectrograms, Mel-spectrograms, scalograms, and current-signature or envelope spectra) and reproduce the acquisition settings.</w:t>
       </w:r>
     </w:p>
     <w:p>
@@ -417,7 +417,7 @@
     </w:p>
     <w:p>
       <w:r>
-        <w:t>The dataset contains raw multi-sensor recordings acquired from a single brushed permanent-magnet DC servo motor on a laboratory test rig. It is published as byte-for-byte raw recordings organised by operating condition, sensor and speed setpoint, together with a per-file metadata index, a 3-D CAD model of the rig, a README descriptor and a licence file. In total the repository contains 386 files (98 BIN, 98 WAV, 98 M4A, 91 XLS, 1 STP). Table 1 lists the top-level organisation of the repository.</w:t>
+        <w:t>The dataset contains raw multi-sensor recordings acquired from a single brushed permanent-magnet DC servo motor on a laboratory test rig. It is published as byte-for-byte raw recordings organised by operating condition, sensor and speed setpoint, together with a per-file metadata index, the Rigol oscilloscope setup file used for the armature-current acquisitions, a README descriptor and a licence file. In total the repository contains 386 files (98 BIN, 98 WAV, 98 M4A, 91 XLS, 1 STP). Table 1 lists the top-level organisation of the repository.</w:t>
       </w:r>
     </w:p>
     <w:p>
@@ -539,7 +539,7 @@
               <w:rPr>
                 <w:sz w:val="19"/>
               </w:rPr>
-              <w:t>cad/</w:t>
+              <w:t>scope_setup/</w:t>
             </w:r>
           </w:p>
         </w:tc>
@@ -553,7 +553,7 @@
               <w:rPr>
                 <w:sz w:val="19"/>
               </w:rPr>
-              <w:t>3-D CAD model of the test rig (1v_3v0.stp)</w:t>
+              <w:t>Rigol MSO5074 oscilloscope setup (settings) file used for the armature-current acquisitions (1v_3v0.stp)</w:t>
             </w:r>
           </w:p>
         </w:tc>
@@ -2663,7 +2663,7 @@
     </w:tbl>
     <w:p>
       <w:r>
-        <w:t>Table 6 gives the number of files available per operating condition and sensor. Coverage is near-complete on the nominal speed grid; the detuned-control conditions reach only a ~65 % top speed setpoint because the detuned controller trips above that speed, the vibration spot readings omit the near-zero-speed points where vibration is negligible, and a few individual speed points may be absent in a branch. The 385 sensor recordings listed in Table 6 are complemented by the CAD model, giving 386 files in total.</w:t>
+        <w:t>Table 6 gives the number of files available per operating condition and sensor. Coverage is near-complete on the nominal speed grid; the detuned-control conditions reach only a ~65 % top speed setpoint because the detuned controller trips above that speed, the vibration spot readings omit the near-zero-speed points where vibration is negligible, and a few individual speed points may be absent in a branch. The 385 sensor recordings listed in Table 6 are complemented by the oscilloscope setup file, giving 386 files in total.</w:t>
       </w:r>
     </w:p>
     <w:p>
@@ -4185,6 +4185,24 @@
           <w:color w:val="000000"/>
           <w:sz w:val="26"/>
         </w:rPr>
+        <w:t>DECLARATION OF GENERATIVE AI AND AI-ASSISTED TECHNOLOGIES IN THE MANUSCRIPT PREPARATION PROCESS</w:t>
+      </w:r>
+    </w:p>
+    <w:p>
+      <w:r>
+        <w:t>During the preparation of this work, the authors used GitHub Copilot (Anthropic Claude) to assist with drafting and language editing of the manuscript text, and to help implement the Python scripts used for dataset organisation, metadata generation, and figure production. All experimental design, data acquisition, and interpretation of the results were performed by the authors. The authors reviewed and edited the output as needed and take full responsibility for the content of the published article.</w:t>
+      </w:r>
+    </w:p>
+    <w:p>
+      <w:pPr>
+        <w:pStyle w:val="Heading1"/>
+      </w:pPr>
+      <w:r>
+        <w:rPr>
+          <w:rFonts w:ascii="Times New Roman" w:hAnsi="Times New Roman"/>
+          <w:color w:val="000000"/>
+          <w:sz w:val="26"/>
+        </w:rPr>
         <w:t>REFERENCES</w:t>
       </w:r>
     </w:p>

</xml_diff>